<commit_message>
am mutat proiectul unde trebuie + tema de laborator cu matrici
</commit_message>
<xml_diff>
--- a/Algoritmi Fundamentali/Teme de Laborator.docx
+++ b/Algoritmi Fundamentali/Teme de Laborator.docx
@@ -214,6 +214,211 @@
           <w:ilvl w:val="0"/>
           <w:numId w:val="1"/>
         </w:numPr>
+        <w:spacing w:after="0" w:line="360" w:lineRule="auto"/>
+        <w:jc w:val="both"/>
+        <w:rPr>
+          <w:rFonts w:ascii="Arial" w:hAnsi="Arial" w:cs="Arial"/>
+          <w:b/>
+          <w:bCs/>
+          <w:sz w:val="24"/>
+          <w:szCs w:val="24"/>
+          <w:lang w:val="ro-RO"/>
+        </w:rPr>
+      </w:pPr>
+      <w:r>
+        <w:rPr>
+          <w:rFonts w:ascii="Arial" w:hAnsi="Arial" w:cs="Arial"/>
+          <w:sz w:val="24"/>
+          <w:szCs w:val="24"/>
+          <w:lang w:val="ro-RO"/>
+        </w:rPr>
+        <w:t xml:space="preserve">Folosind </w:t>
+      </w:r>
+      <w:r>
+        <w:rPr>
+          <w:rFonts w:ascii="Arial" w:hAnsi="Arial" w:cs="Arial"/>
+          <w:sz w:val="24"/>
+          <w:szCs w:val="24"/>
+          <w:lang w:val="ro-RO"/>
+        </w:rPr>
+        <w:t xml:space="preserve">programul </w:t>
+      </w:r>
+      <w:proofErr w:type="spellStart"/>
+      <w:r>
+        <w:rPr>
+          <w:rFonts w:ascii="Arial" w:hAnsi="Arial" w:cs="Arial"/>
+          <w:sz w:val="24"/>
+          <w:szCs w:val="24"/>
+          <w:lang w:val="ro-RO"/>
+        </w:rPr>
+        <w:t>Parcurgere</w:t>
+      </w:r>
+      <w:r>
+        <w:rPr>
+          <w:rFonts w:ascii="Arial" w:hAnsi="Arial" w:cs="Arial"/>
+          <w:sz w:val="24"/>
+          <w:szCs w:val="24"/>
+          <w:lang w:val="ro-RO"/>
+        </w:rPr>
+        <w:t>Matrici</w:t>
+      </w:r>
+      <w:proofErr w:type="spellEnd"/>
+      <w:r>
+        <w:rPr>
+          <w:rFonts w:ascii="Arial" w:hAnsi="Arial" w:cs="Arial"/>
+          <w:sz w:val="24"/>
+          <w:szCs w:val="24"/>
+          <w:lang w:val="ro-RO"/>
+        </w:rPr>
+        <w:t xml:space="preserve">, generați următoarele </w:t>
+      </w:r>
+      <w:proofErr w:type="spellStart"/>
+      <w:r>
+        <w:rPr>
+          <w:rFonts w:ascii="Arial" w:hAnsi="Arial" w:cs="Arial"/>
+          <w:sz w:val="24"/>
+          <w:szCs w:val="24"/>
+          <w:lang w:val="ro-RO"/>
+        </w:rPr>
+        <w:t>matrici</w:t>
+      </w:r>
+      <w:proofErr w:type="spellEnd"/>
+      <w:r>
+        <w:rPr>
+          <w:rFonts w:ascii="Arial" w:hAnsi="Arial" w:cs="Arial"/>
+          <w:sz w:val="24"/>
+          <w:szCs w:val="24"/>
+          <w:lang w:val="ro-RO"/>
+        </w:rPr>
+        <w:t>:</w:t>
+      </w:r>
+    </w:p>
+    <w:p>
+      <w:pPr>
+        <w:spacing w:after="0" w:line="360" w:lineRule="auto"/>
+        <w:ind w:firstLine="720"/>
+        <w:jc w:val="both"/>
+        <w:rPr>
+          <w:rFonts w:ascii="Arial" w:hAnsi="Arial" w:cs="Arial"/>
+          <w:b/>
+          <w:bCs/>
+          <w:sz w:val="24"/>
+          <w:szCs w:val="24"/>
+          <w:lang w:val="ro-RO"/>
+        </w:rPr>
+      </w:pPr>
+      <w:r>
+        <w:rPr>
+          <w:rFonts w:ascii="Arial" w:hAnsi="Arial" w:cs="Arial"/>
+          <w:b/>
+          <w:bCs/>
+          <w:noProof/>
+          <w:sz w:val="24"/>
+          <w:szCs w:val="24"/>
+          <w:lang w:val="ro-RO"/>
+        </w:rPr>
+        <w:drawing>
+          <wp:inline distT="0" distB="0" distL="0" distR="0" wp14:anchorId="135E9CC1" wp14:editId="2FB04140">
+            <wp:extent cx="2518097" cy="2514600"/>
+            <wp:effectExtent l="0" t="0" r="0" b="0"/>
+            <wp:docPr id="421137483" name="Picture 1"/>
+            <wp:cNvGraphicFramePr>
+              <a:graphicFrameLocks xmlns:a="http://schemas.openxmlformats.org/drawingml/2006/main" noChangeAspect="1"/>
+            </wp:cNvGraphicFramePr>
+            <a:graphic xmlns:a="http://schemas.openxmlformats.org/drawingml/2006/main">
+              <a:graphicData uri="http://schemas.openxmlformats.org/drawingml/2006/picture">
+                <pic:pic xmlns:pic="http://schemas.openxmlformats.org/drawingml/2006/picture">
+                  <pic:nvPicPr>
+                    <pic:cNvPr id="421137483" name=""/>
+                    <pic:cNvPicPr/>
+                  </pic:nvPicPr>
+                  <pic:blipFill>
+                    <a:blip r:embed="rId6"/>
+                    <a:stretch>
+                      <a:fillRect/>
+                    </a:stretch>
+                  </pic:blipFill>
+                  <pic:spPr>
+                    <a:xfrm>
+                      <a:off x="0" y="0"/>
+                      <a:ext cx="2554929" cy="2551381"/>
+                    </a:xfrm>
+                    <a:prstGeom prst="rect">
+                      <a:avLst/>
+                    </a:prstGeom>
+                  </pic:spPr>
+                </pic:pic>
+              </a:graphicData>
+            </a:graphic>
+          </wp:inline>
+        </w:drawing>
+      </w:r>
+      <w:r>
+        <w:rPr>
+          <w:rFonts w:ascii="Arial" w:hAnsi="Arial" w:cs="Arial"/>
+          <w:b/>
+          <w:bCs/>
+          <w:sz w:val="24"/>
+          <w:szCs w:val="24"/>
+          <w:lang w:val="ro-RO"/>
+        </w:rPr>
+        <w:t xml:space="preserve">     </w:t>
+      </w:r>
+      <w:r>
+        <w:rPr>
+          <w:noProof/>
+          <w:lang w:val="ro-RO"/>
+        </w:rPr>
+        <w:drawing>
+          <wp:inline distT="0" distB="0" distL="114300" distR="114300" wp14:anchorId="08968F5F" wp14:editId="1306F3D9">
+            <wp:extent cx="2540000" cy="2527300"/>
+            <wp:effectExtent l="0" t="0" r="0" b="6350"/>
+            <wp:docPr id="2" name="Picture 2"/>
+            <wp:cNvGraphicFramePr>
+              <a:graphicFrameLocks xmlns:a="http://schemas.openxmlformats.org/drawingml/2006/main" noChangeAspect="1"/>
+            </wp:cNvGraphicFramePr>
+            <a:graphic xmlns:a="http://schemas.openxmlformats.org/drawingml/2006/main">
+              <a:graphicData uri="http://schemas.openxmlformats.org/drawingml/2006/picture">
+                <pic:pic xmlns:pic="http://schemas.openxmlformats.org/drawingml/2006/picture">
+                  <pic:nvPicPr>
+                    <pic:cNvPr id="2" name="Picture 2"/>
+                    <pic:cNvPicPr>
+                      <a:picLocks noChangeAspect="1"/>
+                    </pic:cNvPicPr>
+                  </pic:nvPicPr>
+                  <pic:blipFill>
+                    <a:blip r:embed="rId7"/>
+                    <a:stretch>
+                      <a:fillRect/>
+                    </a:stretch>
+                  </pic:blipFill>
+                  <pic:spPr>
+                    <a:xfrm>
+                      <a:off x="0" y="0"/>
+                      <a:ext cx="2540000" cy="2527300"/>
+                    </a:xfrm>
+                    <a:prstGeom prst="rect">
+                      <a:avLst/>
+                    </a:prstGeom>
+                    <a:noFill/>
+                    <a:ln>
+                      <a:noFill/>
+                    </a:ln>
+                  </pic:spPr>
+                </pic:pic>
+              </a:graphicData>
+            </a:graphic>
+          </wp:inline>
+        </w:drawing>
+      </w:r>
+    </w:p>
+    <w:p>
+      <w:pPr>
+        <w:pStyle w:val="Listparagraf"/>
+        <w:numPr>
+          <w:ilvl w:val="0"/>
+          <w:numId w:val="1"/>
+        </w:numPr>
         <w:jc w:val="both"/>
         <w:rPr>
           <w:rFonts w:ascii="Arial" w:hAnsi="Arial" w:cs="Arial"/>
@@ -347,8 +552,97 @@
       </w:pPr>
     </w:lvl>
   </w:abstractNum>
+  <w:abstractNum w:abstractNumId="1" w15:restartNumberingAfterBreak="0">
+    <w:nsid w:val="74E84983"/>
+    <w:multiLevelType w:val="hybridMultilevel"/>
+    <w:tmpl w:val="8262670A"/>
+    <w:lvl w:ilvl="0" w:tplc="0409000F">
+      <w:start w:val="1"/>
+      <w:numFmt w:val="decimal"/>
+      <w:lvlText w:val="%1."/>
+      <w:lvlJc w:val="left"/>
+      <w:pPr>
+        <w:ind w:left="720" w:hanging="360"/>
+      </w:pPr>
+    </w:lvl>
+    <w:lvl w:ilvl="1" w:tplc="04090019" w:tentative="1">
+      <w:start w:val="1"/>
+      <w:numFmt w:val="lowerLetter"/>
+      <w:lvlText w:val="%2."/>
+      <w:lvlJc w:val="left"/>
+      <w:pPr>
+        <w:ind w:left="1440" w:hanging="360"/>
+      </w:pPr>
+    </w:lvl>
+    <w:lvl w:ilvl="2" w:tplc="0409001B" w:tentative="1">
+      <w:start w:val="1"/>
+      <w:numFmt w:val="lowerRoman"/>
+      <w:lvlText w:val="%3."/>
+      <w:lvlJc w:val="right"/>
+      <w:pPr>
+        <w:ind w:left="2160" w:hanging="180"/>
+      </w:pPr>
+    </w:lvl>
+    <w:lvl w:ilvl="3" w:tplc="0409000F" w:tentative="1">
+      <w:start w:val="1"/>
+      <w:numFmt w:val="decimal"/>
+      <w:lvlText w:val="%4."/>
+      <w:lvlJc w:val="left"/>
+      <w:pPr>
+        <w:ind w:left="2880" w:hanging="360"/>
+      </w:pPr>
+    </w:lvl>
+    <w:lvl w:ilvl="4" w:tplc="04090019" w:tentative="1">
+      <w:start w:val="1"/>
+      <w:numFmt w:val="lowerLetter"/>
+      <w:lvlText w:val="%5."/>
+      <w:lvlJc w:val="left"/>
+      <w:pPr>
+        <w:ind w:left="3600" w:hanging="360"/>
+      </w:pPr>
+    </w:lvl>
+    <w:lvl w:ilvl="5" w:tplc="0409001B" w:tentative="1">
+      <w:start w:val="1"/>
+      <w:numFmt w:val="lowerRoman"/>
+      <w:lvlText w:val="%6."/>
+      <w:lvlJc w:val="right"/>
+      <w:pPr>
+        <w:ind w:left="4320" w:hanging="180"/>
+      </w:pPr>
+    </w:lvl>
+    <w:lvl w:ilvl="6" w:tplc="0409000F" w:tentative="1">
+      <w:start w:val="1"/>
+      <w:numFmt w:val="decimal"/>
+      <w:lvlText w:val="%7."/>
+      <w:lvlJc w:val="left"/>
+      <w:pPr>
+        <w:ind w:left="5040" w:hanging="360"/>
+      </w:pPr>
+    </w:lvl>
+    <w:lvl w:ilvl="7" w:tplc="04090019" w:tentative="1">
+      <w:start w:val="1"/>
+      <w:numFmt w:val="lowerLetter"/>
+      <w:lvlText w:val="%8."/>
+      <w:lvlJc w:val="left"/>
+      <w:pPr>
+        <w:ind w:left="5760" w:hanging="360"/>
+      </w:pPr>
+    </w:lvl>
+    <w:lvl w:ilvl="8" w:tplc="0409001B" w:tentative="1">
+      <w:start w:val="1"/>
+      <w:numFmt w:val="lowerRoman"/>
+      <w:lvlText w:val="%9."/>
+      <w:lvlJc w:val="right"/>
+      <w:pPr>
+        <w:ind w:left="6480" w:hanging="180"/>
+      </w:pPr>
+    </w:lvl>
+  </w:abstractNum>
   <w:num w:numId="1" w16cid:durableId="1310088893">
     <w:abstractNumId w:val="0"/>
+  </w:num>
+  <w:num w:numId="2" w16cid:durableId="1457944967">
+    <w:abstractNumId w:val="1"/>
   </w:num>
 </w:numbering>
 </file>

</xml_diff>

<commit_message>
Matrice extinsa + 5000 factorial
</commit_message>
<xml_diff>
--- a/Algoritmi Fundamentali/Teme de Laborator.docx
+++ b/Algoritmi Fundamentali/Teme de Laborator.docx
@@ -241,25 +241,7 @@
           <w:szCs w:val="24"/>
           <w:lang w:val="ro-RO"/>
         </w:rPr>
-        <w:t xml:space="preserve">programul </w:t>
-      </w:r>
-      <w:r>
-        <w:rPr>
-          <w:rFonts w:ascii="Arial" w:hAnsi="Arial" w:cs="Arial"/>
-          <w:sz w:val="24"/>
-          <w:szCs w:val="24"/>
-          <w:lang w:val="ro-RO"/>
-        </w:rPr>
-        <w:t>Parcurgere</w:t>
-      </w:r>
-      <w:r>
-        <w:rPr>
-          <w:rFonts w:ascii="Arial" w:hAnsi="Arial" w:cs="Arial"/>
-          <w:sz w:val="24"/>
-          <w:szCs w:val="24"/>
-          <w:lang w:val="ro-RO"/>
-        </w:rPr>
-        <w:t>Matrici, generați următoarele matrici:</w:t>
+        <w:t>programul ParcurgereMatrici, generați următoarele matrici:</w:t>
       </w:r>
     </w:p>
     <w:p>
@@ -380,6 +362,186 @@
           </wp:inline>
         </w:drawing>
       </w:r>
+    </w:p>
+    <w:p>
+      <w:pPr>
+        <w:pStyle w:val="Listparagraf"/>
+        <w:numPr>
+          <w:ilvl w:val="0"/>
+          <w:numId w:val="1"/>
+        </w:numPr>
+        <w:spacing w:after="0"/>
+        <w:jc w:val="both"/>
+        <w:rPr>
+          <w:rFonts w:ascii="Arial" w:hAnsi="Arial" w:cs="Arial"/>
+          <w:sz w:val="24"/>
+          <w:szCs w:val="24"/>
+          <w:lang w:val="ro-RO"/>
+        </w:rPr>
+      </w:pPr>
+      <w:r>
+        <w:rPr>
+          <w:rFonts w:ascii="Arial" w:hAnsi="Arial" w:cs="Arial"/>
+          <w:sz w:val="24"/>
+          <w:szCs w:val="24"/>
+          <w:lang w:val="ro-RO"/>
+        </w:rPr>
+        <w:lastRenderedPageBreak/>
+        <w:t>[Greedy] Problema cu suma de bani. Având o sumă de bani și valorile bancnotelor, trebuie să ajungem la acea sumă de bani folosind cat mai puține bancnote în total. Afișați numărul de bancnote obținute.</w:t>
+      </w:r>
+    </w:p>
+    <w:p>
+      <w:pPr>
+        <w:spacing w:after="0"/>
+        <w:jc w:val="both"/>
+        <w:rPr>
+          <w:rFonts w:ascii="Arial" w:hAnsi="Arial" w:cs="Arial"/>
+          <w:sz w:val="24"/>
+          <w:szCs w:val="24"/>
+          <w:lang w:val="ro-RO"/>
+        </w:rPr>
+      </w:pPr>
+    </w:p>
+    <w:p>
+      <w:pPr>
+        <w:pStyle w:val="Listparagraf"/>
+        <w:numPr>
+          <w:ilvl w:val="0"/>
+          <w:numId w:val="1"/>
+        </w:numPr>
+        <w:jc w:val="both"/>
+        <w:rPr>
+          <w:rFonts w:ascii="Arial" w:hAnsi="Arial" w:cs="Arial"/>
+          <w:sz w:val="24"/>
+          <w:szCs w:val="24"/>
+          <w:lang w:val="ro-RO"/>
+        </w:rPr>
+      </w:pPr>
+      <w:r>
+        <w:rPr>
+          <w:rFonts w:ascii="Arial" w:hAnsi="Arial" w:cs="Arial"/>
+          <w:sz w:val="24"/>
+          <w:szCs w:val="24"/>
+          <w:lang w:val="ro-RO"/>
+        </w:rPr>
+        <w:t xml:space="preserve">Completați codul „6.PregatirePartial”, inspirându-vă de la metoda cu calculul lui 5000 factorial, pentru a calcula și afișa </w:t>
+      </w:r>
+      <w:r>
+        <w:rPr>
+          <w:rFonts w:ascii="Arial" w:hAnsi="Arial" w:cs="Arial"/>
+          <w:sz w:val="24"/>
+          <w:szCs w:val="24"/>
+          <w:lang w:val="ro-RO"/>
+        </w:rPr>
+        <w:t>toate cifrele expresiei (E) unde</w:t>
+      </w:r>
+      <w:r>
+        <w:rPr>
+          <w:rFonts w:ascii="Arial" w:hAnsi="Arial" w:cs="Arial"/>
+          <w:sz w:val="24"/>
+          <w:szCs w:val="24"/>
+          <w:lang w:val="ro-RO"/>
+        </w:rPr>
+        <w:t>:</w:t>
+      </w:r>
+    </w:p>
+    <w:p>
+      <w:pPr>
+        <w:pStyle w:val="Listparagraf"/>
+        <w:rPr>
+          <w:rFonts w:ascii="Arial" w:hAnsi="Arial" w:cs="Arial"/>
+          <w:sz w:val="24"/>
+          <w:szCs w:val="24"/>
+          <w:lang w:val="ro-RO"/>
+        </w:rPr>
+      </w:pPr>
+      <m:oMathPara>
+        <m:oMath>
+          <m:r>
+            <w:rPr>
+              <w:rFonts w:ascii="Cambria Math" w:hAnsi="Cambria Math" w:cs="Arial"/>
+              <w:sz w:val="28"/>
+              <w:szCs w:val="28"/>
+              <w:lang w:val="ro-RO"/>
+            </w:rPr>
+            <m:t>E=</m:t>
+          </m:r>
+          <m:nary>
+            <m:naryPr>
+              <m:chr m:val="∑"/>
+              <m:limLoc m:val="undOvr"/>
+              <m:ctrlPr>
+                <w:rPr>
+                  <w:rFonts w:ascii="Cambria Math" w:hAnsi="Cambria Math" w:cs="Arial"/>
+                  <w:i/>
+                  <w:sz w:val="28"/>
+                  <w:szCs w:val="28"/>
+                  <w:lang w:val="ro-RO"/>
+                </w:rPr>
+              </m:ctrlPr>
+            </m:naryPr>
+            <m:sub>
+              <m:r>
+                <w:rPr>
+                  <w:rFonts w:ascii="Cambria Math" w:hAnsi="Cambria Math" w:cs="Arial"/>
+                  <w:sz w:val="28"/>
+                  <w:szCs w:val="28"/>
+                  <w:lang w:val="ro-RO"/>
+                </w:rPr>
+                <m:t>i=1</m:t>
+              </m:r>
+            </m:sub>
+            <m:sup>
+              <m:r>
+                <w:rPr>
+                  <w:rFonts w:ascii="Cambria Math" w:hAnsi="Cambria Math" w:cs="Arial"/>
+                  <w:sz w:val="28"/>
+                  <w:szCs w:val="28"/>
+                  <w:lang w:val="ro-RO"/>
+                </w:rPr>
+                <m:t>255</m:t>
+              </m:r>
+            </m:sup>
+            <m:e>
+              <m:sSup>
+                <m:sSupPr>
+                  <m:ctrlPr>
+                    <w:rPr>
+                      <w:rFonts w:ascii="Cambria Math" w:hAnsi="Cambria Math" w:cs="Arial"/>
+                      <w:i/>
+                      <w:sz w:val="28"/>
+                      <w:szCs w:val="28"/>
+                      <w:lang w:val="ro-RO"/>
+                    </w:rPr>
+                  </m:ctrlPr>
+                </m:sSupPr>
+                <m:e>
+                  <m:r>
+                    <w:rPr>
+                      <w:rFonts w:ascii="Cambria Math" w:hAnsi="Cambria Math" w:cs="Arial"/>
+                      <w:sz w:val="28"/>
+                      <w:szCs w:val="28"/>
+                      <w:lang w:val="ro-RO"/>
+                    </w:rPr>
+                    <m:t>i</m:t>
+                  </m:r>
+                </m:e>
+                <m:sup>
+                  <m:r>
+                    <w:rPr>
+                      <w:rFonts w:ascii="Cambria Math" w:hAnsi="Cambria Math" w:cs="Arial"/>
+                      <w:sz w:val="28"/>
+                      <w:szCs w:val="28"/>
+                      <w:lang w:val="ro-RO"/>
+                    </w:rPr>
+                    <m:t>i</m:t>
+                  </m:r>
+                </m:sup>
+              </m:sSup>
+            </m:e>
+          </m:nary>
+        </m:oMath>
+      </m:oMathPara>
     </w:p>
     <w:p>
       <w:pPr>
@@ -1576,6 +1738,16 @@
       <w:spacing w:val="5"/>
     </w:rPr>
   </w:style>
+  <w:style w:type="character" w:styleId="Textsubstituent">
+    <w:name w:val="Placeholder Text"/>
+    <w:basedOn w:val="Fontdeparagrafimplicit"/>
+    <w:uiPriority w:val="99"/>
+    <w:semiHidden/>
+    <w:rsid w:val="00B02CA5"/>
+    <w:rPr>
+      <w:color w:val="666666"/>
+    </w:rPr>
+  </w:style>
 </w:styles>
 </file>
 

</xml_diff>